<commit_message>
v1: versión original de la convocatoria DevNet
</commit_message>
<xml_diff>
--- a/CONVOCATORIA DEVNET.docx
+++ b/CONVOCATORIA DEVNET.docx
@@ -981,32 +981,27 @@
         <w:spacing w:after="0" w:line="240" w:lineRule="auto"/>
         <w:ind w:left="360"/>
         <w:rPr>
+          <w:rFonts w:asciiTheme="majorHAnsi" w:hAnsiTheme="majorHAnsi" w:cstheme="majorHAnsi"/>
+          <w:b/>
+          <w:color w:val="000000" w:themeColor="text1"/>
+        </w:rPr>
+      </w:pPr>
+      <w:r>
+        <w:rPr>
           <w:rFonts w:eastAsiaTheme="minorEastAsia" w:cs="Calibri"/>
           <w:color w:val="000000"/>
           <w:lang w:eastAsia="es-ES"/>
         </w:rPr>
-      </w:pPr>
+        <w:t>Fortalecer las competencias en el desarrollo de software orientado a la automatización de redes</w:t>
+      </w:r>
       <w:r>
         <w:rPr>
           <w:rFonts w:eastAsiaTheme="minorEastAsia" w:cs="Calibri"/>
           <w:color w:val="000000"/>
           <w:lang w:eastAsia="es-ES"/>
         </w:rPr>
-        <w:t>Fortalecer las competencias en el desarrollo de software orientado a la automatización de redes, integrando los principios de programación con el conocimiento en diseño, configuración y operación de infraestructuras de red.</w:t>
-      </w:r>
-    </w:p>
-    <w:p>
-      <w:pPr>
-        <w:pStyle w:val="Prrafodelista"/>
-        <w:spacing w:after="5" w:line="249" w:lineRule="auto"/>
-        <w:ind w:left="0"/>
-        <w:jc w:val="both"/>
-        <w:rPr>
-          <w:rFonts w:asciiTheme="majorHAnsi" w:hAnsiTheme="majorHAnsi" w:cstheme="majorHAnsi"/>
-          <w:b/>
-          <w:color w:val="000000" w:themeColor="text1"/>
-        </w:rPr>
-      </w:pPr>
+        <w:t>.</w:t>
+      </w:r>
     </w:p>
     <w:p>
       <w:pPr>
@@ -1248,14 +1243,14 @@
                 <w:rFonts w:asciiTheme="majorHAnsi" w:eastAsia="Times New Roman" w:hAnsiTheme="majorHAnsi" w:cstheme="majorHAnsi"/>
                 <w:color w:val="000000" w:themeColor="text1"/>
               </w:rPr>
-              <w:t>/2025</w:t>
+              <w:t>/202</w:t>
             </w:r>
             <w:r>
               <w:rPr>
                 <w:rFonts w:asciiTheme="majorHAnsi" w:eastAsia="Times New Roman" w:hAnsiTheme="majorHAnsi" w:cstheme="majorHAnsi"/>
                 <w:color w:val="000000" w:themeColor="text1"/>
               </w:rPr>
-              <w:t xml:space="preserve"> </w:t>
+              <w:t>6</w:t>
             </w:r>
           </w:p>
         </w:tc>
@@ -1346,7 +1341,14 @@
                 <w:rFonts w:asciiTheme="majorHAnsi" w:eastAsia="Times New Roman" w:hAnsiTheme="majorHAnsi" w:cstheme="majorHAnsi"/>
                 <w:color w:val="000000" w:themeColor="text1"/>
               </w:rPr>
-              <w:t>/2025</w:t>
+              <w:t>/202</w:t>
+            </w:r>
+            <w:r>
+              <w:rPr>
+                <w:rFonts w:asciiTheme="majorHAnsi" w:eastAsia="Times New Roman" w:hAnsiTheme="majorHAnsi" w:cstheme="majorHAnsi"/>
+                <w:color w:val="000000" w:themeColor="text1"/>
+              </w:rPr>
+              <w:t>6</w:t>
             </w:r>
           </w:p>
         </w:tc>
@@ -1437,7 +1439,14 @@
                 <w:rFonts w:asciiTheme="majorHAnsi" w:eastAsia="Times New Roman" w:hAnsiTheme="majorHAnsi" w:cstheme="majorHAnsi"/>
                 <w:color w:val="000000" w:themeColor="text1"/>
               </w:rPr>
-              <w:t>/2025</w:t>
+              <w:t>/202</w:t>
+            </w:r>
+            <w:r>
+              <w:rPr>
+                <w:rFonts w:asciiTheme="majorHAnsi" w:eastAsia="Times New Roman" w:hAnsiTheme="majorHAnsi" w:cstheme="majorHAnsi"/>
+                <w:color w:val="000000" w:themeColor="text1"/>
+              </w:rPr>
+              <w:t>6</w:t>
             </w:r>
           </w:p>
         </w:tc>
@@ -1528,7 +1537,14 @@
                 <w:rFonts w:asciiTheme="majorHAnsi" w:eastAsia="Times New Roman" w:hAnsiTheme="majorHAnsi" w:cstheme="majorHAnsi"/>
                 <w:color w:val="000000" w:themeColor="text1"/>
               </w:rPr>
-              <w:t>/2025</w:t>
+              <w:t>/202</w:t>
+            </w:r>
+            <w:r>
+              <w:rPr>
+                <w:rFonts w:asciiTheme="majorHAnsi" w:eastAsia="Times New Roman" w:hAnsiTheme="majorHAnsi" w:cstheme="majorHAnsi"/>
+                <w:color w:val="000000" w:themeColor="text1"/>
+              </w:rPr>
+              <w:t>6</w:t>
             </w:r>
           </w:p>
         </w:tc>
@@ -1619,7 +1635,14 @@
                 <w:rFonts w:asciiTheme="majorHAnsi" w:eastAsia="Times New Roman" w:hAnsiTheme="majorHAnsi" w:cstheme="majorHAnsi"/>
                 <w:color w:val="000000" w:themeColor="text1"/>
               </w:rPr>
-              <w:t>/2025</w:t>
+              <w:t>/202</w:t>
+            </w:r>
+            <w:r>
+              <w:rPr>
+                <w:rFonts w:asciiTheme="majorHAnsi" w:eastAsia="Times New Roman" w:hAnsiTheme="majorHAnsi" w:cstheme="majorHAnsi"/>
+                <w:color w:val="000000" w:themeColor="text1"/>
+              </w:rPr>
+              <w:t>6</w:t>
             </w:r>
           </w:p>
         </w:tc>
@@ -1710,7 +1733,14 @@
                 <w:rFonts w:asciiTheme="majorHAnsi" w:eastAsia="Times New Roman" w:hAnsiTheme="majorHAnsi" w:cstheme="majorHAnsi"/>
                 <w:color w:val="000000" w:themeColor="text1"/>
               </w:rPr>
-              <w:t>/2025</w:t>
+              <w:t>/202</w:t>
+            </w:r>
+            <w:r>
+              <w:rPr>
+                <w:rFonts w:asciiTheme="majorHAnsi" w:eastAsia="Times New Roman" w:hAnsiTheme="majorHAnsi" w:cstheme="majorHAnsi"/>
+                <w:color w:val="000000" w:themeColor="text1"/>
+              </w:rPr>
+              <w:t>6</w:t>
             </w:r>
           </w:p>
         </w:tc>
@@ -1824,7 +1854,6 @@
           <w:sz w:val="22"/>
           <w:szCs w:val="22"/>
         </w:rPr>
-        <w:lastRenderedPageBreak/>
         <w:t>Jornada Presencial Sincrónica mediada por TIC</w:t>
       </w:r>
       <w:r>
@@ -2031,6 +2060,7 @@
                 <w:b/>
                 <w:color w:val="auto"/>
               </w:rPr>
+              <w:lastRenderedPageBreak/>
               <w:t>Fecha</w:t>
             </w:r>
           </w:p>

</xml_diff>